<commit_message>
Add NCM build bullet to resume and resume page
</commit_message>
<xml_diff>
--- a/AaronRodriguez_SeniorDE.docx
+++ b/AaronRodriguez_SeniorDE.docx
@@ -177,6 +177,29 @@
           <w:szCs w:val="18"/>
         </w:rPr>
         <w:t xml:space="preserve">  (Official title: BI Engineer III)</w:t>
+      </w:r>
+    </w:p>
+    <w:p>
+      <w:pPr>
+        <w:pStyle w:val="ListParagraph"/>
+        <w:numPr>
+          <w:ilvl w:val="0"/>
+          <w:numId w:val="2"/>
+        </w:numPr>
+        <w:spacing w:after="30" w:before="30" w:line="276" w:lineRule="auto"/>
+      </w:pPr>
+      <w:r>
+        <w:rPr>
+          <w:rFonts w:ascii="Abadi" w:cs="Abadi" w:eastAsia="Abadi" w:hAnsi="Abadi"/>
+          <w:b w:val="false"/>
+          <w:bCs w:val="false"/>
+          <w:i w:val="false"/>
+          <w:iCs w:val="false"/>
+          <w:color w:val="2E3D50"/>
+          <w:sz w:val="20"/>
+          <w:szCs w:val="20"/>
+        </w:rPr>
+        <w:t xml:space="preserve">Built new Databricks notebooks, Fivetran connectors, and SSIS packages — expanding the data platform to support new vendors, business logic requirements, and data sources as they were onboarded.</w:t>
       </w:r>
     </w:p>
     <w:p>

</xml_diff>